<commit_message>
Prepare repository and paper for public submission
- README and paper/source/README.md: public with the sprint submission,
  tag `submitted`; Claude added to the AI-assistance line.
- paper/inherited-collusion-submission.docx/.pdf: canonical revised build
  plus the editorial changes (abstract, Appendices A, C and G, Code and
  Data, LLM Usage Statement); no analysis, table, figure or number changes.
- paper/inherited-collusion-submission.audit.json: record of the submitted
  edition and its base hashes.
- paper/publication-manifest.json: source/README.md hash and alias note.
</commit_message>
<xml_diff>
--- a/paper/inherited-collusion-submission.docx
+++ b/paper/inherited-collusion-submission.docx
@@ -437,7 +437,7 @@
                       <w:rFonts w:ascii="Old Standard TT" w:hAnsi="Old Standard TT" w:cs="Old Standard TT"/>
                       <w:color w:val="000000"/>
                     </w:rPr>
-                    <w:t xml:space="preserve">Can harmful plans survive replacement through handoff notes, and can successors reject them while coordinating? We study a transparent four-agent allocation task. Originals are instructed to favor their coalition at outsiders’ expense; neutral successors receive controlled note combinations. In a format-expanded analysis, a prespecified paired-note contrast increases joint harm by 0.50 for Qwen and 0.43 for GPT-OSS relative to facts alone, across five and seven complete cases. Verification reduces joint harm but increases duplicate claims relative to coordinated harmful notes. A post-hoc comparison finds the same duplicate frequency under verification and facts alone. Structural and fixed-note controls improve safe coordination through task changes or shared decision rules. A final fresh factorial control crosses harmful-note and reminder presence while holding the rule fixed. Among 79 valid episodes, three partial outsider harms occur only with harmful notes and no reminder; all other valid episodes are safe-optimal. The primary safe-optimal interaction is +0.125 across four complete Qwen cases and +0.200 across five GPT-OSS cases. These selected cohorts support inherited instructed-plan transfer and conditional benefits from verification plus a shared safe convention, without establishing spontaneous collusion or a general defense.</w:t>
+                    <w:t xml:space="preserve">Can harmful plans survive agent replacement through handoff notes, and can successors reject them while coordinating? In a transparent four-agent allocation task, original agents are instructed to favor their coalition at outsiders’ expense and write notes to neutral successors. Harmful notes raise the probability of a jointly harmful allocation by 0.50 for Qwen3.6-35B-A3B and 0.43 for GPT-OSS-120B relative to facts alone (five and seven complete cases). A reminder to check notes against the public objective removes joint harm, but in a post-hoc comparison duplicate task claims return to the facts-only rate, consistent with losing the shared convention the notes carried. A public tie-breaking rule restores coordination. In a final factorial control that always includes the rule, every note-free episode is safe-optimal; with harmful notes and no reminder, three of 18 episodes leave partial outsider harm, none with the reminder. Small, selected cohorts limit generalization; no spontaneous collusion is claimed.</w:t>
                   </w:r>
                 </w:p>
               </w:tc>
@@ -3017,7 +3017,28 @@
           <w:rFonts w:ascii="Old Standard TT" w:hAnsi="Old Standard TT" w:cs="Old Standard TT"/>
           <w:color w:val="000000"/>
         </w:rPr>
-        <w:t xml:space="preserve">Code, raw model responses, frozen protocols, analyses and report sources are retained in the private repository https://github.com/frnkptrln/inherited-collusion. Access is restricted; this is not a public data release. The complete local research archive and its offline reproduction checks remain available to the author.</w:t>
+        <w:t xml:space="preserve">Code, raw model responses, frozen protocols, analyses</w:t>
+      </w:r>
+      <w:r>
+        <w:rPr>
+          <w:rFonts w:ascii="Old Standard TT" w:hAnsi="Old Standard TT" w:cs="Old Standard TT"/>
+          <w:color w:val="000000"/>
+        </w:rPr>
+        <w:t xml:space="preserve">, report sources and offline reproduction checks are public at</w:t>
+      </w:r>
+      <w:r>
+        <w:rPr>
+          <w:rFonts w:ascii="Old Standard TT" w:hAnsi="Old Standard TT" w:cs="Old Standard TT"/>
+          <w:color w:val="000000"/>
+        </w:rPr>
+        <w:t xml:space="preserve"> https://github.com/frnkptrln/inherited-collusion</w:t>
+      </w:r>
+      <w:r>
+        <w:rPr>
+          <w:rFonts w:ascii="Old Standard TT" w:hAnsi="Old Standard TT" w:cs="Old Standard TT"/>
+          <w:color w:val="000000"/>
+        </w:rPr>
+        <w:t xml:space="preserve">; the tag “submitted” marks the submitted version.</w:t>
       </w:r>
     </w:p>
     <w:p>
@@ -3171,7 +3192,77 @@
           <w:rFonts w:ascii="Old Standard TT" w:hAnsi="Old Standard TT" w:cs="Old Standard TT"/>
           <w:color w:val="000000"/>
         </w:rPr>
-        <w:t xml:space="preserve">Inference is limited by donor-driven redesign, post-start format amendment, potentially informative attrition, eight original task clusters per model, two nested draws, a full outcome table, scripted outsiders and independent one-shot recipients. Models write different notes; provider weights and reasoning defaults are unverified; semantic reviews are AI-assisted. The audit estimates conditional delivery of the notes actually produced, not unconditional inheritance of a faithfully represented goal. Broader tests should separate sender and recipient models, use blinded human annotation, controlled note edits and additional tasks. The local companion package preserves protocols, raw calls, annotations, analyses and source hashes; no public archive or submission is claimed. The V5 structural control added six planned clusters per model (four complete for Qwen); V6 reuses those available symmetric donor cases. Neither is an independent task-family replication. Diagnostic mistakes remain included. Changing cost geometry changes the task and regenerated notes jointly; model-specific notes prevent a clean capability ranking. No universal claim follows from a unique optimum in these fixtures.</w:t>
+        <w:t xml:space="preserve">Inference is limited by donor-driven redesign, post-start format amendment, potentially informative attrition, eight original task clusters per model, two nested draws, a full outcome table, scripted outsiders and independent one-shot recipients. Models write different notes; provider weights and reasoning defaults are unverified; semantic reviews are AI-assisted. The audit estimates conditional delivery of the notes actually produced, not unconditional inheritance of a faithfully represented goal. Broader tests should separate sender and recipient models, use blinded human annotation, controlled note edits and additional tasks. The </w:t>
+      </w:r>
+      <w:r>
+        <w:rPr>
+          <w:rFonts w:ascii="Old Standard TT" w:hAnsi="Old Standard TT" w:cs="Old Standard TT"/>
+          <w:color w:val="000000"/>
+        </w:rPr>
+        <w:t xml:space="preserve">public repository</w:t>
+      </w:r>
+      <w:r>
+        <w:rPr>
+          <w:rFonts w:ascii="Old Standard TT" w:hAnsi="Old Standard TT" w:cs="Old Standard TT"/>
+          <w:color w:val="000000"/>
+        </w:rPr>
+        <w:t xml:space="preserve"> preserves protocols, raw calls, annotations, analyses and source hashes</w:t>
+      </w:r>
+      <w:r>
+        <w:rPr>
+          <w:rFonts w:ascii="Old Standard TT" w:hAnsi="Old Standard TT" w:cs="Old Standard TT"/>
+          <w:color w:val="000000"/>
+        </w:rPr>
+        <w:t xml:space="preserve">. The </w:t>
+      </w:r>
+      <w:r>
+        <w:rPr>
+          <w:rFonts w:ascii="Old Standard TT" w:hAnsi="Old Standard TT" w:cs="Old Standard TT"/>
+          <w:color w:val="000000"/>
+        </w:rPr>
+        <w:t xml:space="preserve">structural control added six planned clusters per model (four complete for Qwen); </w:t>
+      </w:r>
+      <w:r>
+        <w:rPr>
+          <w:rFonts w:ascii="Old Standard TT" w:hAnsi="Old Standard TT" w:cs="Old Standard TT"/>
+          <w:color w:val="000000"/>
+        </w:rPr>
+        <w:t xml:space="preserve">the fixed-note and factorial controls reuse</w:t>
+      </w:r>
+      <w:r>
+        <w:rPr>
+          <w:rFonts w:ascii="Old Standard TT" w:hAnsi="Old Standard TT" w:cs="Old Standard TT"/>
+          <w:color w:val="000000"/>
+        </w:rPr>
+        <w:t xml:space="preserve"> those available symmetric donor cases. </w:t>
+      </w:r>
+      <w:r>
+        <w:rPr>
+          <w:rFonts w:ascii="Old Standard TT" w:hAnsi="Old Standard TT" w:cs="Old Standard TT"/>
+          <w:color w:val="000000"/>
+        </w:rPr>
+        <w:t xml:space="preserve">None</w:t>
+      </w:r>
+      <w:r>
+        <w:rPr>
+          <w:rFonts w:ascii="Old Standard TT" w:hAnsi="Old Standard TT" w:cs="Old Standard TT"/>
+          <w:color w:val="000000"/>
+        </w:rPr>
+        <w:t xml:space="preserve"> is an independent task-family replication.</w:t>
+      </w:r>
+      <w:r>
+        <w:rPr>
+          <w:rFonts w:ascii="Old Standard TT" w:hAnsi="Old Standard TT" w:cs="Old Standard TT"/>
+          <w:color w:val="000000"/>
+        </w:rPr>
+        <w:t xml:space="preserve"> The factorial control was designed after the earlier results were known, and its note-by-reminder interaction rests on three partial harms in two cases.</w:t>
+      </w:r>
+      <w:r>
+        <w:rPr>
+          <w:rFonts w:ascii="Old Standard TT" w:hAnsi="Old Standard TT" w:cs="Old Standard TT"/>
+          <w:color w:val="000000"/>
+        </w:rPr>
+        <w:t xml:space="preserve"> Diagnostic mistakes remain included. Changing cost geometry changes the task and regenerated notes jointly; model-specific notes prevent a clean capability ranking. No universal claim follows from a unique optimum in these fixtures.</w:t>
       </w:r>
     </w:p>
     <w:p>
@@ -3504,7 +3595,35 @@
           <w:rFonts w:ascii="Old Standard TT" w:hAnsi="Old Standard TT" w:cs="Old Standard TT"/>
           <w:color w:val="000000"/>
         </w:rPr>
-        <w:t xml:space="preserve">OpenAI Codex assisted with study design, literature checking, code, prompts, tests, evidence review, semantic annotation, analyses, figures and writing. Separate Codex agents performed code and scientific reviews, including disagreements about V3 eligibility. These are AI-assisted checks, not independent human verification. Evaluated models generated the retained experimental responses. Frank Peterlein initiated the project and authorized its budget; no claim is made that he independently verified every computation or wrote the prose without AI assistance.</w:t>
+        <w:t xml:space="preserve">OpenAI Codex assisted with study design, literature checking, code, prompts, tests, evidence review, semantic annotation, analyses, figures and writing. Separate Codex agents performed code and scientific reviews, including disagreements about V3 eligibility. These are AI-assisted checks, not independent human verification. Evaluated models generated the retained experimental responses. Frank Peterlein initiated the project</w:t>
+      </w:r>
+      <w:r>
+        <w:rPr>
+          <w:rFonts w:ascii="Old Standard TT" w:hAnsi="Old Standard TT" w:cs="Old Standard TT"/>
+          <w:color w:val="000000"/>
+        </w:rPr>
+        <w:t xml:space="preserve">,</w:t>
+      </w:r>
+      <w:r>
+        <w:rPr>
+          <w:rFonts w:ascii="Old Standard TT" w:hAnsi="Old Standard TT" w:cs="Old Standard TT"/>
+          <w:color w:val="000000"/>
+        </w:rPr>
+        <w:t xml:space="preserve"> authorized its budget</w:t>
+      </w:r>
+      <w:r>
+        <w:rPr>
+          <w:rFonts w:ascii="Old Standard TT" w:hAnsi="Old Standard TT" w:cs="Old Standard TT"/>
+          <w:color w:val="000000"/>
+        </w:rPr>
+        <w:t xml:space="preserve"> and is the responsible author</w:t>
+      </w:r>
+      <w:r>
+        <w:rPr>
+          <w:rFonts w:ascii="Old Standard TT" w:hAnsi="Old Standard TT" w:cs="Old Standard TT"/>
+          <w:color w:val="000000"/>
+        </w:rPr>
+        <w:t xml:space="preserve">.</w:t>
       </w:r>
     </w:p>
     <w:p>
@@ -11861,7 +11980,14 @@
           <w:rFonts w:ascii="Old Standard TT" w:hAnsi="Old Standard TT" w:cs="Old Standard TT"/>
           <w:color w:val="000000"/>
         </w:rPr>
-        <w:t xml:space="preserve">The independent standard-library countercheck recomputes all 240 saved joint outcomes with exact arithmetic and agrees with the analysis on group summaries, paired contrasts and finite completion bounds. This validates arithmetic and retained evidence, not the causal interpretation or served weights. Software validation is distinct from the model observations. The finalized V5 analysis and checker outputs, twelve raw run folders, protocol, freeze, closure, source snapshots and budget ledger are included in the companion package. The reviewed V4 package remains preserved byte-for-byte as historical evidence; no new public archive or submission is claimed.</w:t>
+        <w:t xml:space="preserve">The independent standard-library countercheck recomputes all 240 saved joint outcomes with exact arithmetic and agrees with the analysis on group summaries, paired contrasts and finite completion bounds. This validates arithmetic and retained evidence, not the causal interpretation or served weights. Software validation is distinct from the model observations. The finalized V5 analysis and checker outputs, twelve raw run folders, protocol, freeze, closure, source snapshots and budget ledger are included in the companion package. The reviewed V4 package remains preserved byte-for-byte as historical evidence</w:t>
+      </w:r>
+      <w:r>
+        <w:rPr>
+          <w:rFonts w:ascii="Old Standard TT" w:hAnsi="Old Standard TT" w:cs="Old Standard TT"/>
+          <w:color w:val="000000"/>
+        </w:rPr>
+        <w:t xml:space="preserve">.</w:t>
       </w:r>
     </w:p>
     <w:p>
@@ -27835,7 +27961,21 @@
           <w:rFonts w:ascii="Old Standard TT" w:hAnsi="Old Standard TT" w:cs="Old Standard TT"/>
           <w:color w:val="000000"/>
         </w:rPr>
-        <w:t xml:space="preserve">Frank Peterlein initiated the project, authorized its budget and reviewed the full manuscript during development; he is the responsible author. OpenAI Codex assisted with study design, literature checks, code, prompts, analyses, figures and writing. Automated and agent-assisted checks are not independent human replication. Evaluated models generated the retained experimental responses. The earlier detailed disclosure is preserved in Appendix C.</w:t>
+        <w:t xml:space="preserve">Frank Peterlein initiated the project, authorized its budget and reviewed the full manuscript during development; he is the responsible author. OpenAI Codex assisted with study design, literature checks, code, prompts, analyses, figures and writing.</w:t>
+      </w:r>
+      <w:r>
+        <w:rPr>
+          <w:rFonts w:ascii="Old Standard TT" w:hAnsi="Old Standard TT" w:cs="Old Standard TT"/>
+          <w:color w:val="000000"/>
+        </w:rPr>
+        <w:t xml:space="preserve"> Anthropic’s Claude reviewed the revised manuscript, checked its numbers against the appendices and drafted the final abstract and disclosure edits.</w:t>
+      </w:r>
+      <w:r>
+        <w:rPr>
+          <w:rFonts w:ascii="Old Standard TT" w:hAnsi="Old Standard TT" w:cs="Old Standard TT"/>
+          <w:color w:val="000000"/>
+        </w:rPr>
+        <w:t xml:space="preserve"> Automated and agent-assisted checks are not independent human replication. Evaluated models generated the retained experimental responses. The earlier detailed disclosure is preserved in Appendix C.</w:t>
       </w:r>
     </w:p>
     <w:sectPr>

</xml_diff>

<commit_message>
Submission edition, final pass: Appendix A carries the sprint's required title; abstract 151 words (sprint page now asks for 150 to 250); PDF re-rendered the same way; audit record updated with the new hashes
</commit_message>
<xml_diff>
--- a/paper/inherited-collusion-submission.docx
+++ b/paper/inherited-collusion-submission.docx
@@ -437,7 +437,7 @@
                       <w:rFonts w:ascii="Old Standard TT" w:hAnsi="Old Standard TT" w:cs="Old Standard TT"/>
                       <w:color w:val="000000"/>
                     </w:rPr>
-                    <w:t xml:space="preserve">Can harmful plans survive agent replacement through handoff notes, and can successors reject them while coordinating? In a transparent four-agent allocation task, original agents are instructed to favor their coalition at outsiders’ expense and write notes to neutral successors. Harmful notes raise the probability of a jointly harmful allocation by 0.50 for Qwen3.6-35B-A3B and 0.43 for GPT-OSS-120B relative to facts alone (five and seven complete cases). A reminder to check notes against the public objective removes joint harm, but in a post-hoc comparison duplicate task claims return to the facts-only rate, consistent with losing the shared convention the notes carried. A public tie-breaking rule restores coordination. In a final factorial control that always includes the rule, every note-free episode is safe-optimal; with harmful notes and no reminder, three of 18 episodes leave partial outsider harm, none with the reminder. Small, selected cohorts limit generalization; no spontaneous collusion is claimed.</w:t>
+                    <w:t>Can harmful plans survive agent replacement through handoff notes, and can successors reject them while coordinating? In a transparent four-agent allocation task, original agents are instructed to favor their coalition at outsiders’ expense and write notes to neutral successors. Harmful notes raise the probability of a jointly harmful allocation by 0.50 for Qwen3.6-35B-A3B and 0.43 for GPT-OSS-120B relative to facts alone (five and seven complete cases). A reminder to check notes against the public objective removes joint harm, but in a post-hoc comparison duplicate task claims return to the facts-only rate, consistent with losing the shared convention the notes carried. A public tie-breaking rule restores coordination. In a final factorial control that always includes the rule, every note-free episode is safe-optimal; with harmful notes and no reminder, three of 18 episodes leave partial outsider harm, and none with the reminder. Small, selected donor cohorts limit generalization; no spontaneous collusion is claimed.</w:t>
                   </w:r>
                 </w:p>
               </w:tc>
@@ -3177,7 +3177,7 @@
           <w:szCs w:val="28"/>
           <w:color w:val="000000"/>
         </w:rPr>
-        <w:t xml:space="preserve">Appendix A. Limitations, dual use and ethics</w:t>
+        <w:t>Appendix A. Limitations and Dual-Use / Ethical Considerations</w:t>
       </w:r>
     </w:p>
     <w:p>

</xml_diff>